<commit_message>
docs: comprehensive update - User Guide v3, help.js with Plan tab + Live Metrics, landing page Features section + consulting emphasis
</commit_message>
<xml_diff>
--- a/SlashMyBill-UserGuide-v2.docx
+++ b/SlashMyBill-UserGuide-v2.docx
@@ -35,7 +35,7 @@
         <w:rPr>
           <w:sz w:val="20"/>
         </w:rPr>
-        <w:t>Version 2.0  |  April 2026  |  AWS FinOps Platform</w:t>
+        <w:t>Version 3.0  |  April 2026  |  AWS FinOps Platform</w:t>
       </w:r>
     </w:p>
     <w:p/>
@@ -182,6 +182,29 @@
           </w:tcPr>
           <w:p>
             <w:r>
+              <w:t>Plan</w:t>
+            </w:r>
+          </w:p>
+        </w:tc>
+        <w:tc>
+          <w:tcPr>
+            <w:tcW w:type="dxa" w:w="8640"/>
+          </w:tcPr>
+          <w:p>
+            <w:r>
+              <w:t>Create AWS Budgets with alerts and manage resource tags for cost allocation</w:t>
+            </w:r>
+          </w:p>
+        </w:tc>
+      </w:tr>
+      <w:tr>
+        <w:tc>
+          <w:tcPr>
+            <w:tcW w:type="dxa" w:w="2880"/>
+            <w:shd w:fill="E8EDF5" w:color="auto" w:val="clear"/>
+          </w:tcPr>
+          <w:p>
+            <w:r>
               <w:t>Configure</w:t>
             </w:r>
           </w:p>
@@ -189,6 +212,7 @@
         <w:tc>
           <w:tcPr>
             <w:tcW w:type="dxa" w:w="8640"/>
+            <w:shd w:fill="E8EDF5" w:color="auto" w:val="clear"/>
           </w:tcPr>
           <w:p>
             <w:r>
@@ -711,6 +735,125 @@
     </w:p>
     <w:p>
       <w:pPr>
+        <w:pStyle w:val="Heading2"/>
+      </w:pPr>
+      <w:r>
+        <w:t>3.5 Live Business Metrics Widget</w:t>
+      </w:r>
+    </w:p>
+    <w:p>
+      <w:r>
+        <w:t>The Live Business Metrics widget auto-discovers real operational metrics from your connected AWS accounts and plots them alongside cost data to compute unit economics.</w:t>
+        <w:br/>
+        <w:br/>
+        <w:t>Auto-discovered metrics include:</w:t>
+        <w:br/>
+        <w:t xml:space="preserve">  • Cognito user counts</w:t>
+        <w:br/>
+        <w:t xml:space="preserve">  • DynamoDB item counts</w:t>
+        <w:br/>
+        <w:t xml:space="preserve">  • API Gateway request counts</w:t>
+        <w:br/>
+        <w:t xml:space="preserve">  • Route 53 DNS queries</w:t>
+        <w:br/>
+        <w:t xml:space="preserve">  • CloudWatch custom metrics</w:t>
+        <w:br/>
+        <w:t xml:space="preserve">  • Lambda invocations</w:t>
+        <w:br/>
+        <w:t xml:space="preserve">  • S3 object counts</w:t>
+        <w:br/>
+        <w:br/>
+        <w:t>The widget displays a dual-axis chart:</w:t>
+        <w:br/>
+        <w:t xml:space="preserve">  • Purple bars (left axis): Volume / business metric count</w:t>
+        <w:br/>
+        <w:t xml:space="preserve">  • Amber line (right axis): Cost per unit</w:t>
+        <w:br/>
+        <w:br/>
+        <w:t>Use the metric selector dropdown to switch between "Auto-Discovered" and "Manual" metric groups. The cost dimension selector lets you choose Total Account Cost, per-service cost, or tag-based cost for the unit economics calculation. Each auto-discovered metric is auto-mapped to a default cost dimension (e.g., Cognito users → Cognito service cost).</w:t>
+        <w:br/>
+        <w:br/>
+        <w:t>The chart shows a 6-month time-series by default. This widget replaces the old manual "Unit Cost Trend" widget.</w:t>
+      </w:r>
+    </w:p>
+    <w:p>
+      <w:pPr>
+        <w:ind w:left="432"/>
+      </w:pPr>
+      <w:r>
+        <w:rPr>
+          <w:i/>
+          <w:color w:val="166534"/>
+        </w:rPr>
+        <w:t>💡 Tip: Auto-discovered metrics require no manual configuration — just connect your AWS account and the widget populates automatically.</w:t>
+      </w:r>
+    </w:p>
+    <w:p>
+      <w:pPr>
+        <w:pStyle w:val="Heading2"/>
+      </w:pPr>
+      <w:r>
+        <w:t>3.6 Tag Distribution Widget</w:t>
+      </w:r>
+    </w:p>
+    <w:p>
+      <w:r>
+        <w:t>The Tag Distribution widget shows resource count distribution by tag value as a donut chart. It uses the AWS Resource Groups Tagging API to scan your connected accounts.</w:t>
+        <w:br/>
+        <w:br/>
+        <w:t>Click "Manage Tags ▶" to navigate to Plan → Tag Resources for bulk tag management.</w:t>
+      </w:r>
+    </w:p>
+    <w:p>
+      <w:pPr>
+        <w:pStyle w:val="Heading2"/>
+      </w:pPr>
+      <w:r>
+        <w:t>3.7 Budget KPI Card</w:t>
+      </w:r>
+    </w:p>
+    <w:p>
+      <w:r>
+        <w:t>The Budget KPI card appears in the KPI bar and shows your current spend vs budget limit as a progress bar. If you have active AWS Budgets configured via the Plan tab, the card displays the budget with the highest utilization percentage.</w:t>
+        <w:br/>
+        <w:br/>
+        <w:t>Click the Budget KPI card to navigate directly to Plan → Budget for detailed budget management.</w:t>
+      </w:r>
+    </w:p>
+    <w:p>
+      <w:r>
+        <w:t>Use the account selector dropdown (top right of the dashboard) to choose which accounts to include. All accounts are selected by default. Your selection is preserved when you switch between Observe, Chat, and Act tabs.</w:t>
+      </w:r>
+    </w:p>
+    <w:p>
+      <w:pPr>
+        <w:pStyle w:val="Heading2"/>
+      </w:pPr>
+      <w:r>
+        <w:t>3.4 Cost by Service Drill-Down</w:t>
+      </w:r>
+    </w:p>
+    <w:p>
+      <w:r>
+        <w:t>The Cost by Service treemap supports 2-phase drill-down:</w:t>
+        <w:br/>
+        <w:br/>
+        <w:t xml:space="preserve">  Level 1 (Services): Shows all AWS services as colored tiles sized by cost</w:t>
+        <w:br/>
+        <w:t xml:space="preserve">  Level 2 (Usage Types): Click any service tile to see its usage type breakdown (e.g., EC2-Other breaks into VolumeUsage.gp3, NatGateway-Hours, DataTransfer)</w:t>
+        <w:br/>
+        <w:br/>
+        <w:t>Navigation:</w:t>
+        <w:br/>
+        <w:t xml:space="preserve">  • Click a tile → drill into usage types</w:t>
+        <w:br/>
+        <w:t xml:space="preserve">  • Click "← All Services" breadcrumb → return to service view</w:t>
+        <w:br/>
+        <w:t xml:space="preserve">  • Click "Details ↗" → open side panel with bar chart + AI chat button</w:t>
+      </w:r>
+    </w:p>
+    <w:p>
+      <w:pPr>
         <w:pStyle w:val="Heading1"/>
       </w:pPr>
       <w:r>
@@ -783,6 +926,9 @@
         <w:br/>
         <w:br/>
         <w:t>The AI will show the AWS API commands it executed, then provide a detailed answer with specific resource IDs, dollar amounts, and actionable recommendations.</w:t>
+        <w:br/>
+        <w:br/>
+        <w:t>The AI always recommends SlashMyBill in-app features when relevant — for example, "Go to Plan → Budget" to create cost alerts, or "Go to Act → Scheduler" to automate stop/start schedules — instead of directing you to the AWS Console.</w:t>
       </w:r>
     </w:p>
     <w:p>
@@ -1357,6 +1503,128 @@
     </w:p>
     <w:p>
       <w:pPr>
+        <w:pStyle w:val="Heading2"/>
+      </w:pPr>
+      <w:r>
+        <w:t>5.7 Plan Tab — Budget Management</w:t>
+      </w:r>
+    </w:p>
+    <w:p>
+      <w:r>
+        <w:t>The Plan tab lets you create and manage AWS Budgets directly from SlashMyBill. Budgets are created in your actual AWS account via the AWS Budgets API.</w:t>
+        <w:br/>
+        <w:br/>
+        <w:t>Creating a budget:</w:t>
+        <w:br/>
+        <w:t xml:space="preserve">  1. Go to Plan → Budget</w:t>
+        <w:br/>
+        <w:t xml:space="preserve">  2. Click "+ Create Budget"</w:t>
+        <w:br/>
+        <w:t xml:space="preserve">  3. Enter a monthly budget amount (e.g., $500)</w:t>
+        <w:br/>
+        <w:t xml:space="preserve">  4. Configure alert thresholds — default thresholds are 50%, 75%, 100%, and 120% of the budget</w:t>
+        <w:br/>
+        <w:t xml:space="preserve">  5. Add email addresses for notifications</w:t>
+        <w:br/>
+        <w:t xml:space="preserve">  6. Optionally add tag-based budget filtering (e.g., Environment=production) to scope the budget to specific resources</w:t>
+        <w:br/>
+        <w:t xml:space="preserve">  7. Click "Create"</w:t>
+        <w:br/>
+        <w:br/>
+        <w:t>Managing budgets:</w:t>
+        <w:br/>
+        <w:t xml:space="preserve">  • Edit: Change the budget amount or alert thresholds</w:t>
+        <w:br/>
+        <w:t xml:space="preserve">  • Delete: Remove the budget from your AWS account</w:t>
+        <w:br/>
+        <w:t xml:space="preserve">  • View: See existing budgets with spend vs limit progress bars showing current utilization</w:t>
+      </w:r>
+    </w:p>
+    <w:p>
+      <w:pPr>
+        <w:ind w:left="432"/>
+      </w:pPr>
+      <w:r>
+        <w:rPr>
+          <w:i/>
+          <w:color w:val="166534"/>
+        </w:rPr>
+        <w:t>💡 Tip: Budget alerts come directly from AWS, not SlashMyBill — so they work even if you are not logged in.</w:t>
+      </w:r>
+    </w:p>
+    <w:p>
+      <w:pPr>
+        <w:ind w:left="432"/>
+      </w:pPr>
+      <w:r>
+        <w:rPr>
+          <w:i/>
+          <w:color w:val="92400E"/>
+        </w:rPr>
+        <w:t>⚠ Note: For tag-based budgets, use the TagKeyValue format (e.g., user:Environment$production). The Plan tab handles this formatting automatically.</w:t>
+      </w:r>
+    </w:p>
+    <w:p>
+      <w:pPr>
+        <w:pStyle w:val="Heading2"/>
+      </w:pPr>
+      <w:r>
+        <w:t>5.8 Plan Tab — Tag Resources</w:t>
+      </w:r>
+    </w:p>
+    <w:p>
+      <w:r>
+        <w:t>The Tag Resources sub-tab scans all resources across your connected accounts for tag coverage and lets you bulk-apply tags.</w:t>
+        <w:br/>
+        <w:br/>
+        <w:t>Features:</w:t>
+        <w:br/>
+        <w:t xml:space="preserve">  • Scans resources using the AWS Resource Groups Tagging API</w:t>
+        <w:br/>
+        <w:t xml:space="preserve">  • Shows tagged resources with green ✓ badges and untagged resources with red badges</w:t>
+        <w:br/>
+        <w:t xml:space="preserve">  • Pre-populates required tag keys: Environment, Owner, CostCenter, Application</w:t>
+        <w:br/>
+        <w:t xml:space="preserve">  • Select multiple resources and bulk-apply tags in one action</w:t>
+        <w:br/>
+        <w:t xml:space="preserve">  • Sticky table headers for easy scrolling through large resource lists</w:t>
+        <w:br/>
+        <w:br/>
+        <w:t>To tag resources:</w:t>
+        <w:br/>
+        <w:t xml:space="preserve">  1. Go to Plan → Tag Resources</w:t>
+        <w:br/>
+        <w:t xml:space="preserve">  2. Review the resource list — untagged resources are highlighted</w:t>
+        <w:br/>
+        <w:t xml:space="preserve">  3. Select resources using the checkboxes</w:t>
+        <w:br/>
+        <w:t xml:space="preserve">  4. Enter tag key-value pairs</w:t>
+        <w:br/>
+        <w:t xml:space="preserve">  5. Click "Apply Tags" to tag all selected resources</w:t>
+      </w:r>
+    </w:p>
+    <w:p>
+      <w:pPr>
+        <w:pStyle w:val="Heading2"/>
+      </w:pPr>
+      <w:r>
+        <w:t>5.9 Paddle Payment Integration</w:t>
+      </w:r>
+    </w:p>
+    <w:p>
+      <w:r>
+        <w:t>SlashMyBill uses Paddle as its Merchant of Record for all payments.</w:t>
+        <w:br/>
+        <w:br/>
+        <w:t xml:space="preserve">  • Upgrade plans: Click the "Upgrade" button in the header to switch to Growth or Scale</w:t>
+        <w:br/>
+        <w:t xml:space="preserve">  • Buy token top-ups: Click the 🪙 coin icon in the header to purchase additional tokens</w:t>
+        <w:br/>
+        <w:t xml:space="preserve">  • All payments are processed securely by Paddle, which handles tax, invoicing, and compliance</w:t>
+      </w:r>
+    </w:p>
+    <w:p>
+      <w:pPr>
         <w:pStyle w:val="Heading1"/>
       </w:pPr>
       <w:r>
@@ -1910,6 +2178,73 @@
           </w:p>
         </w:tc>
       </w:tr>
+      <w:tr>
+        <w:tc>
+          <w:tcPr>
+            <w:tcW w:type="dxa" w:w="2880"/>
+            <w:shd w:fill="E8EDF5" w:color="auto" w:val="clear"/>
+          </w:tcPr>
+          <w:p>
+            <w:r>
+              <w:t>Budget creation fails with InvalidParameterException</w:t>
+            </w:r>
+          </w:p>
+        </w:tc>
+        <w:tc>
+          <w:tcPr>
+            <w:tcW w:type="dxa" w:w="3600"/>
+            <w:shd w:fill="E8EDF5" w:color="auto" w:val="clear"/>
+          </w:tcPr>
+          <w:p>
+            <w:r>
+              <w:t>Tag filter uses unsupported dimension</w:t>
+            </w:r>
+          </w:p>
+        </w:tc>
+        <w:tc>
+          <w:tcPr>
+            <w:tcW w:type="dxa" w:w="5040"/>
+            <w:shd w:fill="E8EDF5" w:color="auto" w:val="clear"/>
+          </w:tcPr>
+          <w:p>
+            <w:r>
+              <w:t>Use TagKeyValue format for tag-based budgets</w:t>
+            </w:r>
+          </w:p>
+        </w:tc>
+      </w:tr>
+      <w:tr>
+        <w:tc>
+          <w:tcPr>
+            <w:tcW w:type="dxa" w:w="2880"/>
+          </w:tcPr>
+          <w:p>
+            <w:r>
+              <w:t>Live metrics shows no data</w:t>
+            </w:r>
+          </w:p>
+        </w:tc>
+        <w:tc>
+          <w:tcPr>
+            <w:tcW w:type="dxa" w:w="3600"/>
+          </w:tcPr>
+          <w:p>
+            <w:r>
+              <w:t>No connected accounts or permissions missing</w:t>
+            </w:r>
+          </w:p>
+        </w:tc>
+        <w:tc>
+          <w:tcPr>
+            <w:tcW w:type="dxa" w:w="5040"/>
+          </w:tcPr>
+          <w:p>
+            <w:r>
+              <w:t>Connect an account and redeploy latest CF template</w:t>
+            </w:r>
+          </w:p>
+        </w:tc>
+      </w:tr>
     </w:tbl>
     <w:p>
       <w:pPr>
@@ -2036,6 +2371,36 @@
     <w:p>
       <w:r>
         <w:t>A: Yes. Go to Act → Scheduler and create a stop/start schedule. SlashMyBill uses EventBridge Scheduler to automatically stop your instances at the configured time and start them again in the morning. You can pause or delete schedules at any time.</w:t>
+      </w:r>
+    </w:p>
+    <w:p/>
+    <w:p>
+      <w:r>
+        <w:rPr>
+          <w:b/>
+          <w:color w:val="1F3864"/>
+        </w:rPr>
+        <w:t>Q: Can I get expert help implementing the recommendations?</w:t>
+      </w:r>
+    </w:p>
+    <w:p>
+      <w:r>
+        <w:t>A: Yes! SlashMyBill offers AI-driven consulting services. After analyzing your bill, click "Book a Free Consultation" to schedule a call with our FinOps experts. We implement all optimizations for you — you only pay 25% of the yearly savings we deliver.</w:t>
+      </w:r>
+    </w:p>
+    <w:p/>
+    <w:p>
+      <w:r>
+        <w:rPr>
+          <w:b/>
+          <w:color w:val="1F3864"/>
+        </w:rPr>
+        <w:t>Q: What is the Plan tab for?</w:t>
+      </w:r>
+    </w:p>
+    <w:p>
+      <w:r>
+        <w:t>A: The Plan tab lets you create AWS Budgets with cost alerts and manage resource tags for cost allocation. Budgets are created directly in your AWS account so alerts come from AWS, not SlashMyBill.</w:t>
       </w:r>
     </w:p>
     <w:p/>

</xml_diff>